<commit_message>
Add initial project files for DSC640 term project
- Created a new Jupyter notebook for the final project titled "final_prokect.ipynb" with project overview and guidelines.
- Added milestone 1 notebook "milestone1_vance.ipynb" outlining the purpose and target audience.
- Included the dataset "nationaldatabaseofchildcareprices.xlsx" for analysis.
- Deleted temporary file "~$signment 5.2.docx" and updated .DS_Store in the data visualization directory.
</commit_message>
<xml_diff>
--- a/fall2025/dsc630_data_prediction/week5/Assignment 5.2.docx
+++ b/fall2025/dsc630_data_prediction/week5/Assignment 5.2.docx
@@ -3,13 +3,757 @@
 <w:document xmlns:wpc="http://schemas.microsoft.com/office/word/2010/wordprocessingCanvas" xmlns:cx="http://schemas.microsoft.com/office/drawing/2014/chartex" xmlns:cx1="http://schemas.microsoft.com/office/drawing/2015/9/8/chartex" xmlns:cx2="http://schemas.microsoft.com/office/drawing/2015/10/21/chartex" xmlns:cx3="http://schemas.microsoft.com/office/drawing/2016/5/9/chartex" xmlns:cx4="http://schemas.microsoft.com/office/drawing/2016/5/10/chartex" xmlns:cx5="http://schemas.microsoft.com/office/drawing/2016/5/11/chartex" xmlns:cx6="http://schemas.microsoft.com/office/drawing/2016/5/12/chartex" xmlns:cx7="http://schemas.microsoft.com/office/drawing/2016/5/13/chartex" xmlns:cx8="http://schemas.microsoft.com/office/drawing/2016/5/14/chartex" xmlns:mc="http://schemas.openxmlformats.org/markup-compatibility/2006" xmlns:aink="http://schemas.microsoft.com/office/drawing/2016/ink" xmlns:am3d="http://schemas.microsoft.com/office/drawing/2017/model3d" xmlns:o="urn:schemas-microsoft-com:office:office" xmlns:oel="http://schemas.microsoft.com/office/2019/extlst" xmlns:r="http://schemas.openxmlformats.org/officeDocument/2006/relationships" xmlns:m="http://schemas.openxmlformats.org/officeDocument/2006/math" xmlns:v="urn:schemas-microsoft-com:vml" xmlns:wp14="http://schemas.microsoft.com/office/word/2010/wordprocessingDrawing" xmlns:wp="http://schemas.openxmlformats.org/drawingml/2006/wordprocessingDrawing" xmlns:w10="urn:schemas-microsoft-com:office:word" xmlns:w="http://schemas.openxmlformats.org/wordprocessingml/2006/main" xmlns:w14="http://schemas.microsoft.com/office/word/2010/wordml" xmlns:w15="http://schemas.microsoft.com/office/word/2012/wordml" xmlns:w16cex="http://schemas.microsoft.com/office/word/2018/wordml/cex" xmlns:w16cid="http://schemas.microsoft.com/office/word/2016/wordml/cid" xmlns:w16="http://schemas.microsoft.com/office/word/2018/wordml" xmlns:w16du="http://schemas.microsoft.com/office/word/2023/wordml/word16du" xmlns:w16sdtdh="http://schemas.microsoft.com/office/word/2020/wordml/sdtdatahash" xmlns:w16sdtfl="http://schemas.microsoft.com/office/word/2024/wordml/sdtformatlock" xmlns:w16se="http://schemas.microsoft.com/office/word/2015/wordml/symex" xmlns:wpg="http://schemas.microsoft.com/office/word/2010/wordprocessingGroup" xmlns:wpi="http://schemas.microsoft.com/office/word/2010/wordprocessingInk" xmlns:wne="http://schemas.microsoft.com/office/word/2006/wordml" xmlns:wps="http://schemas.microsoft.com/office/word/2010/wordprocessingShape" mc:Ignorable="w14 w15 w16se w16cid w16 w16cex w16sdtdh w16sdtfl w16du wp14">
   <w:body>
     <w:p/>
+    <w:p/>
+    <w:p>
+      <w:pPr>
+        <w:shd w:val="clear" w:color="auto" w:fill="FFFFFF"/>
+        <w:spacing w:after="0" w:line="240" w:lineRule="auto"/>
+        <w:rPr>
+          <w:rFonts w:ascii="Open Sans" w:eastAsia="Times New Roman" w:hAnsi="Open Sans" w:cs="Open Sans"/>
+          <w:color w:val="262626"/>
+          <w:kern w:val="0"/>
+          <w:sz w:val="21"/>
+          <w:szCs w:val="21"/>
+          <w14:ligatures w14:val="none"/>
+        </w:rPr>
+      </w:pPr>
+      <w:r>
+        <w:rPr>
+          <w:rFonts w:ascii="Open Sans" w:eastAsia="Times New Roman" w:hAnsi="Open Sans" w:cs="Open Sans"/>
+          <w:b/>
+          <w:bCs/>
+          <w:color w:val="000000"/>
+          <w:kern w:val="0"/>
+          <w:sz w:val="21"/>
+          <w:szCs w:val="21"/>
+          <w14:ligatures w14:val="none"/>
+        </w:rPr>
+        <w:t>Introduction:</w:t>
+      </w:r>
+    </w:p>
+    <w:p>
+      <w:pPr>
+        <w:shd w:val="clear" w:color="auto" w:fill="FFFFFF"/>
+        <w:spacing w:after="0" w:line="240" w:lineRule="auto"/>
+        <w:rPr>
+          <w:rFonts w:ascii="Open Sans" w:eastAsia="Times New Roman" w:hAnsi="Open Sans" w:cs="Open Sans"/>
+          <w:color w:val="262626"/>
+          <w:kern w:val="0"/>
+          <w:sz w:val="21"/>
+          <w:szCs w:val="21"/>
+          <w14:ligatures w14:val="none"/>
+        </w:rPr>
+      </w:pPr>
+    </w:p>
+    <w:p>
+      <w:pPr>
+        <w:numPr>
+          <w:ilvl w:val="0"/>
+          <w:numId w:val="1"/>
+        </w:numPr>
+        <w:shd w:val="clear" w:color="auto" w:fill="FFFFFF"/>
+        <w:spacing w:after="0" w:line="240" w:lineRule="auto"/>
+        <w:rPr>
+          <w:rFonts w:ascii="Open Sans" w:eastAsia="Times New Roman" w:hAnsi="Open Sans" w:cs="Open Sans"/>
+          <w:color w:val="262626"/>
+          <w:kern w:val="0"/>
+          <w:sz w:val="21"/>
+          <w:szCs w:val="21"/>
+          <w14:ligatures w14:val="none"/>
+        </w:rPr>
+      </w:pPr>
+      <w:r>
+        <w:rPr>
+          <w:rFonts w:ascii="Open Sans" w:eastAsia="Times New Roman" w:hAnsi="Open Sans" w:cs="Open Sans"/>
+          <w:color w:val="262626"/>
+          <w:kern w:val="0"/>
+          <w:sz w:val="21"/>
+          <w:szCs w:val="21"/>
+          <w14:ligatures w14:val="none"/>
+        </w:rPr>
+        <w:t>What was the problem being solved?</w:t>
+      </w:r>
+    </w:p>
+    <w:p>
+      <w:pPr>
+        <w:numPr>
+          <w:ilvl w:val="0"/>
+          <w:numId w:val="1"/>
+        </w:numPr>
+        <w:shd w:val="clear" w:color="auto" w:fill="FFFFFF"/>
+        <w:spacing w:after="0" w:line="240" w:lineRule="auto"/>
+        <w:rPr>
+          <w:rFonts w:ascii="Open Sans" w:eastAsia="Times New Roman" w:hAnsi="Open Sans" w:cs="Open Sans"/>
+          <w:color w:val="262626"/>
+          <w:kern w:val="0"/>
+          <w:sz w:val="21"/>
+          <w:szCs w:val="21"/>
+          <w14:ligatures w14:val="none"/>
+        </w:rPr>
+      </w:pPr>
+      <w:r>
+        <w:rPr>
+          <w:rFonts w:ascii="Open Sans" w:eastAsia="Times New Roman" w:hAnsi="Open Sans" w:cs="Open Sans"/>
+          <w:color w:val="262626"/>
+          <w:kern w:val="0"/>
+          <w:sz w:val="21"/>
+          <w:szCs w:val="21"/>
+          <w14:ligatures w14:val="none"/>
+        </w:rPr>
+        <w:t>Why was this problem important to solve?</w:t>
+      </w:r>
+    </w:p>
+    <w:p>
+      <w:pPr>
+        <w:numPr>
+          <w:ilvl w:val="0"/>
+          <w:numId w:val="1"/>
+        </w:numPr>
+        <w:shd w:val="clear" w:color="auto" w:fill="FFFFFF"/>
+        <w:spacing w:after="0" w:line="240" w:lineRule="auto"/>
+        <w:rPr>
+          <w:rFonts w:ascii="Open Sans" w:eastAsia="Times New Roman" w:hAnsi="Open Sans" w:cs="Open Sans"/>
+          <w:color w:val="262626"/>
+          <w:kern w:val="0"/>
+          <w:sz w:val="21"/>
+          <w:szCs w:val="21"/>
+          <w14:ligatures w14:val="none"/>
+        </w:rPr>
+      </w:pPr>
+      <w:r>
+        <w:rPr>
+          <w:rFonts w:ascii="Open Sans" w:eastAsia="Times New Roman" w:hAnsi="Open Sans" w:cs="Open Sans"/>
+          <w:color w:val="262626"/>
+          <w:kern w:val="0"/>
+          <w:sz w:val="21"/>
+          <w:szCs w:val="21"/>
+          <w14:ligatures w14:val="none"/>
+        </w:rPr>
+        <w:t>How was the data acquired?</w:t>
+      </w:r>
+    </w:p>
+    <w:p>
+      <w:pPr>
+        <w:shd w:val="clear" w:color="auto" w:fill="FFFFFF"/>
+        <w:spacing w:after="0" w:line="240" w:lineRule="auto"/>
+        <w:ind w:firstLine="360"/>
+        <w:rPr>
+          <w:rFonts w:ascii="Open Sans" w:eastAsia="Times New Roman" w:hAnsi="Open Sans" w:cs="Open Sans"/>
+          <w:color w:val="262626"/>
+          <w:kern w:val="0"/>
+          <w:sz w:val="21"/>
+          <w:szCs w:val="21"/>
+          <w14:ligatures w14:val="none"/>
+        </w:rPr>
+      </w:pPr>
+      <w:r>
+        <w:rPr>
+          <w:rFonts w:ascii="Open Sans" w:eastAsia="Times New Roman" w:hAnsi="Open Sans" w:cs="Open Sans"/>
+          <w:color w:val="262626"/>
+          <w:kern w:val="0"/>
+          <w:sz w:val="21"/>
+          <w:szCs w:val="21"/>
+          <w14:ligatures w14:val="none"/>
+        </w:rPr>
+        <w:t xml:space="preserve">The International Research Journal of Education and Technology published a paper in their Peer Reviewed Journal that addressed new uses of AI to detect Fake News. This deep dive paper labeled “Predictive and Prescriptive Analysis of Fake News Detection System Using Machine Learning” takes a stand on the harms of fake news. Large amounts of information, especially related to the news, are communicated over the Internet, an </w:t>
+      </w:r>
+      <w:proofErr w:type="gramStart"/>
+      <w:r>
+        <w:rPr>
+          <w:rFonts w:ascii="Open Sans" w:eastAsia="Times New Roman" w:hAnsi="Open Sans" w:cs="Open Sans"/>
+          <w:color w:val="262626"/>
+          <w:kern w:val="0"/>
+          <w:sz w:val="21"/>
+          <w:szCs w:val="21"/>
+          <w14:ligatures w14:val="none"/>
+        </w:rPr>
+        <w:t>ever expanding</w:t>
+      </w:r>
+      <w:proofErr w:type="gramEnd"/>
+      <w:r>
+        <w:rPr>
+          <w:rFonts w:ascii="Open Sans" w:eastAsia="Times New Roman" w:hAnsi="Open Sans" w:cs="Open Sans"/>
+          <w:color w:val="262626"/>
+          <w:kern w:val="0"/>
+          <w:sz w:val="21"/>
+          <w:szCs w:val="21"/>
+          <w14:ligatures w14:val="none"/>
+        </w:rPr>
+        <w:t xml:space="preserve"> medium. With the digital age came new means of spreading information, and social media websites like </w:t>
+      </w:r>
+      <w:proofErr w:type="spellStart"/>
+      <w:r>
+        <w:rPr>
+          <w:rFonts w:ascii="Open Sans" w:eastAsia="Times New Roman" w:hAnsi="Open Sans" w:cs="Open Sans"/>
+          <w:color w:val="262626"/>
+          <w:kern w:val="0"/>
+          <w:sz w:val="21"/>
+          <w:szCs w:val="21"/>
+          <w14:ligatures w14:val="none"/>
+        </w:rPr>
+        <w:t>facebook</w:t>
+      </w:r>
+      <w:proofErr w:type="spellEnd"/>
+      <w:r>
+        <w:rPr>
+          <w:rFonts w:ascii="Open Sans" w:eastAsia="Times New Roman" w:hAnsi="Open Sans" w:cs="Open Sans"/>
+          <w:color w:val="262626"/>
+          <w:kern w:val="0"/>
+          <w:sz w:val="21"/>
+          <w:szCs w:val="21"/>
+          <w14:ligatures w14:val="none"/>
+        </w:rPr>
+        <w:t xml:space="preserve">, reddit, and 4chan achieved rapid growth and popularity without </w:t>
+      </w:r>
+    </w:p>
+    <w:p>
+      <w:pPr>
+        <w:shd w:val="clear" w:color="auto" w:fill="FFFFFF"/>
+        <w:spacing w:after="0" w:line="240" w:lineRule="auto"/>
+        <w:rPr>
+          <w:rFonts w:ascii="Open Sans" w:eastAsia="Times New Roman" w:hAnsi="Open Sans" w:cs="Open Sans"/>
+          <w:color w:val="262626"/>
+          <w:kern w:val="0"/>
+          <w:sz w:val="21"/>
+          <w:szCs w:val="21"/>
+          <w14:ligatures w14:val="none"/>
+        </w:rPr>
+      </w:pPr>
+      <w:r>
+        <w:rPr>
+          <w:rFonts w:ascii="Open Sans" w:eastAsia="Times New Roman" w:hAnsi="Open Sans" w:cs="Open Sans"/>
+          <w:color w:val="262626"/>
+          <w:kern w:val="0"/>
+          <w:sz w:val="21"/>
+          <w:szCs w:val="21"/>
+          <w14:ligatures w14:val="none"/>
+        </w:rPr>
+        <w:tab/>
+        <w:t xml:space="preserve">Fake news is false information that has been purposely misrepresented or manufactured and is disseminated as authentic news. Because it requires little research and is closer to fiction, it can be created and rapidly dispersed with little effort. Troll farms and bots spam articles across social media, </w:t>
+      </w:r>
+      <w:r>
+        <w:rPr>
+          <w:rFonts w:ascii="Open Sans" w:eastAsia="Times New Roman" w:hAnsi="Open Sans" w:cs="Open Sans"/>
+          <w:color w:val="262626"/>
+          <w:kern w:val="0"/>
+          <w:sz w:val="21"/>
+          <w:szCs w:val="21"/>
+          <w14:ligatures w14:val="none"/>
+        </w:rPr>
+        <w:t xml:space="preserve">and if they’re banned or shutdown, they can easily be spun up. </w:t>
+      </w:r>
+    </w:p>
+    <w:p>
+      <w:pPr>
+        <w:shd w:val="clear" w:color="auto" w:fill="FFFFFF"/>
+        <w:spacing w:after="0" w:line="240" w:lineRule="auto"/>
+        <w:rPr>
+          <w:rFonts w:ascii="Open Sans" w:eastAsia="Times New Roman" w:hAnsi="Open Sans" w:cs="Open Sans"/>
+          <w:color w:val="262626"/>
+          <w:kern w:val="0"/>
+          <w:sz w:val="21"/>
+          <w:szCs w:val="21"/>
+          <w14:ligatures w14:val="none"/>
+        </w:rPr>
+      </w:pPr>
+      <w:r>
+        <w:rPr>
+          <w:rFonts w:ascii="Open Sans" w:eastAsia="Times New Roman" w:hAnsi="Open Sans" w:cs="Open Sans"/>
+          <w:color w:val="262626"/>
+          <w:kern w:val="0"/>
+          <w:sz w:val="21"/>
+          <w:szCs w:val="21"/>
+          <w14:ligatures w14:val="none"/>
+        </w:rPr>
+        <w:tab/>
+        <w:t xml:space="preserve">The consequences of fake news are also noted, as the pursuit is not only ethical but essential to democracy and public interest. Fake news changes elections and controls the electorate. Poor to wealth, no-education to college-educated, constituents can be brainwashed into believed outlandish stories.  </w:t>
+      </w:r>
+    </w:p>
+    <w:p>
+      <w:pPr>
+        <w:shd w:val="clear" w:color="auto" w:fill="FFFFFF"/>
+        <w:spacing w:after="0" w:line="240" w:lineRule="auto"/>
+        <w:rPr>
+          <w:rFonts w:ascii="Open Sans" w:eastAsia="Times New Roman" w:hAnsi="Open Sans" w:cs="Open Sans"/>
+          <w:color w:val="262626"/>
+          <w:kern w:val="0"/>
+          <w:sz w:val="21"/>
+          <w:szCs w:val="21"/>
+          <w14:ligatures w14:val="none"/>
+        </w:rPr>
+      </w:pPr>
+      <w:r>
+        <w:rPr>
+          <w:rFonts w:ascii="Open Sans" w:eastAsia="Times New Roman" w:hAnsi="Open Sans" w:cs="Open Sans"/>
+          <w:color w:val="262626"/>
+          <w:kern w:val="0"/>
+          <w:sz w:val="21"/>
+          <w:szCs w:val="21"/>
+          <w14:ligatures w14:val="none"/>
+        </w:rPr>
+        <w:tab/>
+        <w:t xml:space="preserve">Data collection was largely focused on two pools: real news and fake news. Ultimately, the source of news was the key indicator for collection. Reputable sources </w:t>
+      </w:r>
+      <w:r>
+        <w:rPr>
+          <w:rFonts w:ascii="Open Sans" w:eastAsia="Times New Roman" w:hAnsi="Open Sans" w:cs="Open Sans"/>
+          <w:color w:val="262626"/>
+          <w:kern w:val="0"/>
+          <w:sz w:val="21"/>
+          <w:szCs w:val="21"/>
+          <w14:ligatures w14:val="none"/>
+        </w:rPr>
+        <w:t xml:space="preserve">had higher contribution for the real news, such as periodicals or well-known newspapers. By comparison, fake news was obtained from false news outlets. </w:t>
+      </w:r>
+      <w:proofErr w:type="gramStart"/>
+      <w:r>
+        <w:rPr>
+          <w:rFonts w:ascii="Open Sans" w:eastAsia="Times New Roman" w:hAnsi="Open Sans" w:cs="Open Sans"/>
+          <w:color w:val="262626"/>
+          <w:kern w:val="0"/>
+          <w:sz w:val="21"/>
+          <w:szCs w:val="21"/>
+          <w14:ligatures w14:val="none"/>
+        </w:rPr>
+        <w:t>Additionally</w:t>
+      </w:r>
+      <w:proofErr w:type="gramEnd"/>
+      <w:r>
+        <w:rPr>
+          <w:rFonts w:ascii="Open Sans" w:eastAsia="Times New Roman" w:hAnsi="Open Sans" w:cs="Open Sans"/>
+          <w:color w:val="262626"/>
+          <w:kern w:val="0"/>
+          <w:sz w:val="21"/>
+          <w:szCs w:val="21"/>
+          <w14:ligatures w14:val="none"/>
+        </w:rPr>
+        <w:t xml:space="preserve"> fact-checking websites maintained a list of fact-checked stories. To ensure diversity, data was collected from a wide variety of resources.</w:t>
+      </w:r>
+    </w:p>
+    <w:p>
+      <w:pPr>
+        <w:shd w:val="clear" w:color="auto" w:fill="FFFFFF"/>
+        <w:spacing w:after="0" w:line="240" w:lineRule="auto"/>
+        <w:rPr>
+          <w:rFonts w:ascii="Open Sans" w:eastAsia="Times New Roman" w:hAnsi="Open Sans" w:cs="Open Sans"/>
+          <w:color w:val="262626"/>
+          <w:kern w:val="0"/>
+          <w:sz w:val="21"/>
+          <w:szCs w:val="21"/>
+          <w14:ligatures w14:val="none"/>
+        </w:rPr>
+      </w:pPr>
+      <w:r>
+        <w:rPr>
+          <w:rFonts w:ascii="Open Sans" w:eastAsia="Times New Roman" w:hAnsi="Open Sans" w:cs="Open Sans"/>
+          <w:color w:val="262626"/>
+          <w:kern w:val="0"/>
+          <w:sz w:val="21"/>
+          <w:szCs w:val="21"/>
+          <w14:ligatures w14:val="none"/>
+        </w:rPr>
+        <w:tab/>
+        <w:t>After collection, data was tokenized, a specialized process where textual data is transformed to be consumed by machine learning algorithms. Feature extraction determined the value of words per article.</w:t>
+      </w:r>
+    </w:p>
+    <w:p>
+      <w:pPr>
+        <w:shd w:val="clear" w:color="auto" w:fill="FFFFFF"/>
+        <w:spacing w:after="0" w:line="240" w:lineRule="auto"/>
+        <w:rPr>
+          <w:rFonts w:ascii="Open Sans" w:eastAsia="Times New Roman" w:hAnsi="Open Sans" w:cs="Open Sans"/>
+          <w:color w:val="262626"/>
+          <w:kern w:val="0"/>
+          <w:sz w:val="21"/>
+          <w:szCs w:val="21"/>
+          <w14:ligatures w14:val="none"/>
+        </w:rPr>
+      </w:pPr>
+    </w:p>
+    <w:p>
+      <w:pPr>
+        <w:shd w:val="clear" w:color="auto" w:fill="FFFFFF"/>
+        <w:spacing w:after="0" w:line="240" w:lineRule="auto"/>
+        <w:rPr>
+          <w:rFonts w:ascii="Open Sans" w:eastAsia="Times New Roman" w:hAnsi="Open Sans" w:cs="Open Sans"/>
+          <w:color w:val="262626"/>
+          <w:kern w:val="0"/>
+          <w:sz w:val="21"/>
+          <w:szCs w:val="21"/>
+          <w14:ligatures w14:val="none"/>
+        </w:rPr>
+      </w:pPr>
+      <w:r>
+        <w:rPr>
+          <w:rFonts w:ascii="Open Sans" w:eastAsia="Times New Roman" w:hAnsi="Open Sans" w:cs="Open Sans"/>
+          <w:b/>
+          <w:bCs/>
+          <w:color w:val="262626"/>
+          <w:kern w:val="0"/>
+          <w:sz w:val="21"/>
+          <w:szCs w:val="21"/>
+          <w14:ligatures w14:val="none"/>
+        </w:rPr>
+        <w:t>Methods and Results:</w:t>
+      </w:r>
+    </w:p>
+    <w:p>
+      <w:pPr>
+        <w:shd w:val="clear" w:color="auto" w:fill="FFFFFF"/>
+        <w:spacing w:after="0" w:line="240" w:lineRule="auto"/>
+        <w:rPr>
+          <w:rFonts w:ascii="Open Sans" w:eastAsia="Times New Roman" w:hAnsi="Open Sans" w:cs="Open Sans"/>
+          <w:color w:val="262626"/>
+          <w:kern w:val="0"/>
+          <w:sz w:val="21"/>
+          <w:szCs w:val="21"/>
+          <w14:ligatures w14:val="none"/>
+        </w:rPr>
+      </w:pPr>
+    </w:p>
+    <w:p>
+      <w:pPr>
+        <w:numPr>
+          <w:ilvl w:val="0"/>
+          <w:numId w:val="2"/>
+        </w:numPr>
+        <w:shd w:val="clear" w:color="auto" w:fill="FFFFFF"/>
+        <w:spacing w:after="0" w:line="240" w:lineRule="auto"/>
+        <w:rPr>
+          <w:rFonts w:ascii="Open Sans" w:eastAsia="Times New Roman" w:hAnsi="Open Sans" w:cs="Open Sans"/>
+          <w:color w:val="262626"/>
+          <w:kern w:val="0"/>
+          <w:sz w:val="21"/>
+          <w:szCs w:val="21"/>
+          <w14:ligatures w14:val="none"/>
+        </w:rPr>
+      </w:pPr>
+      <w:r>
+        <w:rPr>
+          <w:rFonts w:ascii="Open Sans" w:eastAsia="Times New Roman" w:hAnsi="Open Sans" w:cs="Open Sans"/>
+          <w:color w:val="262626"/>
+          <w:kern w:val="0"/>
+          <w:sz w:val="21"/>
+          <w:szCs w:val="21"/>
+          <w14:ligatures w14:val="none"/>
+        </w:rPr>
+        <w:t>What steps were taken to prepare the data?</w:t>
+      </w:r>
+    </w:p>
+    <w:p>
+      <w:pPr>
+        <w:numPr>
+          <w:ilvl w:val="0"/>
+          <w:numId w:val="2"/>
+        </w:numPr>
+        <w:shd w:val="clear" w:color="auto" w:fill="FFFFFF"/>
+        <w:spacing w:after="0" w:line="240" w:lineRule="auto"/>
+        <w:rPr>
+          <w:rFonts w:ascii="Open Sans" w:eastAsia="Times New Roman" w:hAnsi="Open Sans" w:cs="Open Sans"/>
+          <w:color w:val="262626"/>
+          <w:kern w:val="0"/>
+          <w:sz w:val="21"/>
+          <w:szCs w:val="21"/>
+          <w14:ligatures w14:val="none"/>
+        </w:rPr>
+      </w:pPr>
+      <w:r>
+        <w:rPr>
+          <w:rFonts w:ascii="Open Sans" w:eastAsia="Times New Roman" w:hAnsi="Open Sans" w:cs="Open Sans"/>
+          <w:color w:val="262626"/>
+          <w:kern w:val="0"/>
+          <w:sz w:val="21"/>
+          <w:szCs w:val="21"/>
+          <w14:ligatures w14:val="none"/>
+        </w:rPr>
+        <w:t>How was this problem solved?</w:t>
+      </w:r>
+    </w:p>
+    <w:p>
+      <w:pPr>
+        <w:numPr>
+          <w:ilvl w:val="0"/>
+          <w:numId w:val="2"/>
+        </w:numPr>
+        <w:shd w:val="clear" w:color="auto" w:fill="FFFFFF"/>
+        <w:spacing w:after="0" w:line="240" w:lineRule="auto"/>
+        <w:rPr>
+          <w:rFonts w:ascii="Open Sans" w:eastAsia="Times New Roman" w:hAnsi="Open Sans" w:cs="Open Sans"/>
+          <w:color w:val="262626"/>
+          <w:kern w:val="0"/>
+          <w:sz w:val="21"/>
+          <w:szCs w:val="21"/>
+          <w14:ligatures w14:val="none"/>
+        </w:rPr>
+      </w:pPr>
+      <w:r>
+        <w:rPr>
+          <w:rFonts w:ascii="Open Sans" w:eastAsia="Times New Roman" w:hAnsi="Open Sans" w:cs="Open Sans"/>
+          <w:color w:val="262626"/>
+          <w:kern w:val="0"/>
+          <w:sz w:val="21"/>
+          <w:szCs w:val="21"/>
+          <w14:ligatures w14:val="none"/>
+        </w:rPr>
+        <w:t>What modeling techniques were used?</w:t>
+      </w:r>
+    </w:p>
+    <w:p>
+      <w:pPr>
+        <w:numPr>
+          <w:ilvl w:val="0"/>
+          <w:numId w:val="2"/>
+        </w:numPr>
+        <w:shd w:val="clear" w:color="auto" w:fill="FFFFFF"/>
+        <w:spacing w:after="0" w:line="240" w:lineRule="auto"/>
+        <w:rPr>
+          <w:rFonts w:ascii="Open Sans" w:eastAsia="Times New Roman" w:hAnsi="Open Sans" w:cs="Open Sans"/>
+          <w:color w:val="262626"/>
+          <w:kern w:val="0"/>
+          <w:sz w:val="21"/>
+          <w:szCs w:val="21"/>
+          <w14:ligatures w14:val="none"/>
+        </w:rPr>
+      </w:pPr>
+      <w:r>
+        <w:rPr>
+          <w:rFonts w:ascii="Open Sans" w:eastAsia="Times New Roman" w:hAnsi="Open Sans" w:cs="Open Sans"/>
+          <w:color w:val="262626"/>
+          <w:kern w:val="0"/>
+          <w:sz w:val="21"/>
+          <w:szCs w:val="21"/>
+          <w14:ligatures w14:val="none"/>
+        </w:rPr>
+        <w:t>Why did the team choose the methods/models they did?</w:t>
+      </w:r>
+    </w:p>
+    <w:p>
+      <w:pPr>
+        <w:numPr>
+          <w:ilvl w:val="0"/>
+          <w:numId w:val="2"/>
+        </w:numPr>
+        <w:shd w:val="clear" w:color="auto" w:fill="FFFFFF"/>
+        <w:spacing w:after="0" w:line="240" w:lineRule="auto"/>
+        <w:rPr>
+          <w:rFonts w:ascii="Open Sans" w:eastAsia="Times New Roman" w:hAnsi="Open Sans" w:cs="Open Sans"/>
+          <w:color w:val="262626"/>
+          <w:kern w:val="0"/>
+          <w:sz w:val="21"/>
+          <w:szCs w:val="21"/>
+          <w14:ligatures w14:val="none"/>
+        </w:rPr>
+      </w:pPr>
+      <w:r>
+        <w:rPr>
+          <w:rFonts w:ascii="Open Sans" w:eastAsia="Times New Roman" w:hAnsi="Open Sans" w:cs="Open Sans"/>
+          <w:color w:val="262626"/>
+          <w:kern w:val="0"/>
+          <w:sz w:val="21"/>
+          <w:szCs w:val="21"/>
+          <w14:ligatures w14:val="none"/>
+        </w:rPr>
+        <w:t xml:space="preserve">What metrics were used to evaluate the results? Why </w:t>
+      </w:r>
+      <w:proofErr w:type="gramStart"/>
+      <w:r>
+        <w:rPr>
+          <w:rFonts w:ascii="Open Sans" w:eastAsia="Times New Roman" w:hAnsi="Open Sans" w:cs="Open Sans"/>
+          <w:color w:val="262626"/>
+          <w:kern w:val="0"/>
+          <w:sz w:val="21"/>
+          <w:szCs w:val="21"/>
+          <w14:ligatures w14:val="none"/>
+        </w:rPr>
+        <w:t>was</w:t>
+      </w:r>
+      <w:proofErr w:type="gramEnd"/>
+      <w:r>
+        <w:rPr>
+          <w:rFonts w:ascii="Open Sans" w:eastAsia="Times New Roman" w:hAnsi="Open Sans" w:cs="Open Sans"/>
+          <w:color w:val="262626"/>
+          <w:kern w:val="0"/>
+          <w:sz w:val="21"/>
+          <w:szCs w:val="21"/>
+          <w14:ligatures w14:val="none"/>
+        </w:rPr>
+        <w:t xml:space="preserve"> this metric chosen?</w:t>
+      </w:r>
+    </w:p>
+    <w:p>
+      <w:pPr>
+        <w:shd w:val="clear" w:color="auto" w:fill="FFFFFF"/>
+        <w:spacing w:after="0" w:line="240" w:lineRule="auto"/>
+        <w:rPr>
+          <w:rFonts w:ascii="Open Sans" w:eastAsia="Times New Roman" w:hAnsi="Open Sans" w:cs="Open Sans"/>
+          <w:color w:val="262626"/>
+          <w:kern w:val="0"/>
+          <w:sz w:val="21"/>
+          <w:szCs w:val="21"/>
+          <w14:ligatures w14:val="none"/>
+        </w:rPr>
+      </w:pPr>
+    </w:p>
+    <w:p>
+      <w:pPr>
+        <w:shd w:val="clear" w:color="auto" w:fill="FFFFFF"/>
+        <w:spacing w:after="0" w:line="240" w:lineRule="auto"/>
+        <w:rPr>
+          <w:rFonts w:ascii="Open Sans" w:eastAsia="Times New Roman" w:hAnsi="Open Sans" w:cs="Open Sans"/>
+          <w:color w:val="262626"/>
+          <w:kern w:val="0"/>
+          <w:sz w:val="21"/>
+          <w:szCs w:val="21"/>
+          <w14:ligatures w14:val="none"/>
+        </w:rPr>
+      </w:pPr>
+      <w:r>
+        <w:rPr>
+          <w:rFonts w:ascii="Open Sans" w:eastAsia="Times New Roman" w:hAnsi="Open Sans" w:cs="Open Sans"/>
+          <w:b/>
+          <w:bCs/>
+          <w:color w:val="262626"/>
+          <w:kern w:val="0"/>
+          <w:sz w:val="21"/>
+          <w:szCs w:val="21"/>
+          <w14:ligatures w14:val="none"/>
+        </w:rPr>
+        <w:t>Conclusion:</w:t>
+      </w:r>
+    </w:p>
+    <w:p>
+      <w:pPr>
+        <w:shd w:val="clear" w:color="auto" w:fill="FFFFFF"/>
+        <w:spacing w:after="0" w:line="240" w:lineRule="auto"/>
+        <w:rPr>
+          <w:rFonts w:ascii="Open Sans" w:eastAsia="Times New Roman" w:hAnsi="Open Sans" w:cs="Open Sans"/>
+          <w:color w:val="262626"/>
+          <w:kern w:val="0"/>
+          <w:sz w:val="21"/>
+          <w:szCs w:val="21"/>
+          <w14:ligatures w14:val="none"/>
+        </w:rPr>
+      </w:pPr>
+    </w:p>
+    <w:p>
+      <w:pPr>
+        <w:numPr>
+          <w:ilvl w:val="0"/>
+          <w:numId w:val="3"/>
+        </w:numPr>
+        <w:shd w:val="clear" w:color="auto" w:fill="FFFFFF"/>
+        <w:spacing w:after="0" w:line="240" w:lineRule="auto"/>
+        <w:rPr>
+          <w:rFonts w:ascii="Open Sans" w:eastAsia="Times New Roman" w:hAnsi="Open Sans" w:cs="Open Sans"/>
+          <w:color w:val="262626"/>
+          <w:kern w:val="0"/>
+          <w:sz w:val="21"/>
+          <w:szCs w:val="21"/>
+          <w14:ligatures w14:val="none"/>
+        </w:rPr>
+      </w:pPr>
+      <w:r>
+        <w:rPr>
+          <w:rFonts w:ascii="Open Sans" w:eastAsia="Times New Roman" w:hAnsi="Open Sans" w:cs="Open Sans"/>
+          <w:color w:val="262626"/>
+          <w:kern w:val="0"/>
+          <w:sz w:val="21"/>
+          <w:szCs w:val="21"/>
+          <w14:ligatures w14:val="none"/>
+        </w:rPr>
+        <w:t>How were the results or model implemented?</w:t>
+      </w:r>
+    </w:p>
+    <w:p>
+      <w:pPr>
+        <w:numPr>
+          <w:ilvl w:val="0"/>
+          <w:numId w:val="3"/>
+        </w:numPr>
+        <w:shd w:val="clear" w:color="auto" w:fill="FFFFFF"/>
+        <w:spacing w:after="0" w:line="240" w:lineRule="auto"/>
+        <w:rPr>
+          <w:rFonts w:ascii="Open Sans" w:eastAsia="Times New Roman" w:hAnsi="Open Sans" w:cs="Open Sans"/>
+          <w:color w:val="262626"/>
+          <w:kern w:val="0"/>
+          <w:sz w:val="21"/>
+          <w:szCs w:val="21"/>
+          <w14:ligatures w14:val="none"/>
+        </w:rPr>
+      </w:pPr>
+      <w:r>
+        <w:rPr>
+          <w:rFonts w:ascii="Open Sans" w:eastAsia="Times New Roman" w:hAnsi="Open Sans" w:cs="Open Sans"/>
+          <w:color w:val="262626"/>
+          <w:kern w:val="0"/>
+          <w:sz w:val="21"/>
+          <w:szCs w:val="21"/>
+          <w14:ligatures w14:val="none"/>
+        </w:rPr>
+        <w:t>What were the actionable consequences of the case study?</w:t>
+      </w:r>
+    </w:p>
+    <w:p>
+      <w:pPr>
+        <w:numPr>
+          <w:ilvl w:val="0"/>
+          <w:numId w:val="3"/>
+        </w:numPr>
+        <w:shd w:val="clear" w:color="auto" w:fill="FFFFFF"/>
+        <w:spacing w:after="0" w:line="240" w:lineRule="auto"/>
+        <w:rPr>
+          <w:rFonts w:ascii="Open Sans" w:eastAsia="Times New Roman" w:hAnsi="Open Sans" w:cs="Open Sans"/>
+          <w:color w:val="262626"/>
+          <w:kern w:val="0"/>
+          <w:sz w:val="21"/>
+          <w:szCs w:val="21"/>
+          <w14:ligatures w14:val="none"/>
+        </w:rPr>
+      </w:pPr>
+      <w:r>
+        <w:rPr>
+          <w:rFonts w:ascii="Open Sans" w:eastAsia="Times New Roman" w:hAnsi="Open Sans" w:cs="Open Sans"/>
+          <w:color w:val="262626"/>
+          <w:kern w:val="0"/>
+          <w:sz w:val="21"/>
+          <w:szCs w:val="21"/>
+          <w14:ligatures w14:val="none"/>
+        </w:rPr>
+        <w:t>What did the team learn from the case study?</w:t>
+      </w:r>
+    </w:p>
+    <w:p>
+      <w:pPr>
+        <w:numPr>
+          <w:ilvl w:val="0"/>
+          <w:numId w:val="3"/>
+        </w:numPr>
+        <w:shd w:val="clear" w:color="auto" w:fill="FFFFFF"/>
+        <w:spacing w:after="0" w:line="240" w:lineRule="auto"/>
+        <w:rPr>
+          <w:rFonts w:ascii="Open Sans" w:eastAsia="Times New Roman" w:hAnsi="Open Sans" w:cs="Open Sans"/>
+          <w:color w:val="262626"/>
+          <w:kern w:val="0"/>
+          <w:sz w:val="21"/>
+          <w:szCs w:val="21"/>
+          <w14:ligatures w14:val="none"/>
+        </w:rPr>
+      </w:pPr>
+      <w:r>
+        <w:rPr>
+          <w:rFonts w:ascii="Open Sans" w:eastAsia="Times New Roman" w:hAnsi="Open Sans" w:cs="Open Sans"/>
+          <w:color w:val="262626"/>
+          <w:kern w:val="0"/>
+          <w:sz w:val="21"/>
+          <w:szCs w:val="21"/>
+          <w14:ligatures w14:val="none"/>
+        </w:rPr>
+        <w:t>How should or would the team approach the problem differently in the future?</w:t>
+      </w:r>
+    </w:p>
+    <w:p/>
     <w:sectPr>
-      <w:headerReference w:type="even" r:id="rId6"/>
       <w:headerReference w:type="default" r:id="rId7"/>
-      <w:footerReference w:type="even" r:id="rId8"/>
-      <w:footerReference w:type="default" r:id="rId9"/>
-      <w:headerReference w:type="first" r:id="rId10"/>
-      <w:footerReference w:type="first" r:id="rId11"/>
       <w:pgSz w:w="12240" w:h="15840"/>
       <w:pgMar w:top="1440" w:right="1440" w:bottom="1440" w:left="1440" w:header="720" w:footer="720" w:gutter="0"/>
       <w:cols w:space="720"/>
@@ -44,36 +788,6 @@
 </w:endnotes>
 </file>
 
-<file path=word/footer1.xml><?xml version="1.0" encoding="utf-8"?>
-<w:ftr xmlns:wpc="http://schemas.microsoft.com/office/word/2010/wordprocessingCanvas" xmlns:cx="http://schemas.microsoft.com/office/drawing/2014/chartex" xmlns:cx1="http://schemas.microsoft.com/office/drawing/2015/9/8/chartex" xmlns:cx2="http://schemas.microsoft.com/office/drawing/2015/10/21/chartex" xmlns:cx3="http://schemas.microsoft.com/office/drawing/2016/5/9/chartex" xmlns:cx4="http://schemas.microsoft.com/office/drawing/2016/5/10/chartex" xmlns:cx5="http://schemas.microsoft.com/office/drawing/2016/5/11/chartex" xmlns:cx6="http://schemas.microsoft.com/office/drawing/2016/5/12/chartex" xmlns:cx7="http://schemas.microsoft.com/office/drawing/2016/5/13/chartex" xmlns:cx8="http://schemas.microsoft.com/office/drawing/2016/5/14/chartex" xmlns:mc="http://schemas.openxmlformats.org/markup-compatibility/2006" xmlns:aink="http://schemas.microsoft.com/office/drawing/2016/ink" xmlns:am3d="http://schemas.microsoft.com/office/drawing/2017/model3d" xmlns:o="urn:schemas-microsoft-com:office:office" xmlns:oel="http://schemas.microsoft.com/office/2019/extlst" xmlns:r="http://schemas.openxmlformats.org/officeDocument/2006/relationships" xmlns:m="http://schemas.openxmlformats.org/officeDocument/2006/math" xmlns:v="urn:schemas-microsoft-com:vml" xmlns:wp14="http://schemas.microsoft.com/office/word/2010/wordprocessingDrawing" xmlns:wp="http://schemas.openxmlformats.org/drawingml/2006/wordprocessingDrawing" xmlns:w10="urn:schemas-microsoft-com:office:word" xmlns:w="http://schemas.openxmlformats.org/wordprocessingml/2006/main" xmlns:w14="http://schemas.microsoft.com/office/word/2010/wordml" xmlns:w15="http://schemas.microsoft.com/office/word/2012/wordml" xmlns:w16cex="http://schemas.microsoft.com/office/word/2018/wordml/cex" xmlns:w16cid="http://schemas.microsoft.com/office/word/2016/wordml/cid" xmlns:w16="http://schemas.microsoft.com/office/word/2018/wordml" xmlns:w16du="http://schemas.microsoft.com/office/word/2023/wordml/word16du" xmlns:w16sdtdh="http://schemas.microsoft.com/office/word/2020/wordml/sdtdatahash" xmlns:w16sdtfl="http://schemas.microsoft.com/office/word/2024/wordml/sdtformatlock" xmlns:w16se="http://schemas.microsoft.com/office/word/2015/wordml/symex" xmlns:wpg="http://schemas.microsoft.com/office/word/2010/wordprocessingGroup" xmlns:wpi="http://schemas.microsoft.com/office/word/2010/wordprocessingInk" xmlns:wne="http://schemas.microsoft.com/office/word/2006/wordml" xmlns:wps="http://schemas.microsoft.com/office/word/2010/wordprocessingShape" mc:Ignorable="w14 w15 w16se w16cid w16 w16cex w16sdtdh w16sdtfl w16du wp14">
-  <w:p>
-    <w:pPr>
-      <w:pStyle w:val="Footer"/>
-    </w:pPr>
-  </w:p>
-</w:ftr>
-</file>
-
-<file path=word/footer2.xml><?xml version="1.0" encoding="utf-8"?>
-<w:ftr xmlns:wpc="http://schemas.microsoft.com/office/word/2010/wordprocessingCanvas" xmlns:cx="http://schemas.microsoft.com/office/drawing/2014/chartex" xmlns:cx1="http://schemas.microsoft.com/office/drawing/2015/9/8/chartex" xmlns:cx2="http://schemas.microsoft.com/office/drawing/2015/10/21/chartex" xmlns:cx3="http://schemas.microsoft.com/office/drawing/2016/5/9/chartex" xmlns:cx4="http://schemas.microsoft.com/office/drawing/2016/5/10/chartex" xmlns:cx5="http://schemas.microsoft.com/office/drawing/2016/5/11/chartex" xmlns:cx6="http://schemas.microsoft.com/office/drawing/2016/5/12/chartex" xmlns:cx7="http://schemas.microsoft.com/office/drawing/2016/5/13/chartex" xmlns:cx8="http://schemas.microsoft.com/office/drawing/2016/5/14/chartex" xmlns:mc="http://schemas.openxmlformats.org/markup-compatibility/2006" xmlns:aink="http://schemas.microsoft.com/office/drawing/2016/ink" xmlns:am3d="http://schemas.microsoft.com/office/drawing/2017/model3d" xmlns:o="urn:schemas-microsoft-com:office:office" xmlns:oel="http://schemas.microsoft.com/office/2019/extlst" xmlns:r="http://schemas.openxmlformats.org/officeDocument/2006/relationships" xmlns:m="http://schemas.openxmlformats.org/officeDocument/2006/math" xmlns:v="urn:schemas-microsoft-com:vml" xmlns:wp14="http://schemas.microsoft.com/office/word/2010/wordprocessingDrawing" xmlns:wp="http://schemas.openxmlformats.org/drawingml/2006/wordprocessingDrawing" xmlns:w10="urn:schemas-microsoft-com:office:word" xmlns:w="http://schemas.openxmlformats.org/wordprocessingml/2006/main" xmlns:w14="http://schemas.microsoft.com/office/word/2010/wordml" xmlns:w15="http://schemas.microsoft.com/office/word/2012/wordml" xmlns:w16cex="http://schemas.microsoft.com/office/word/2018/wordml/cex" xmlns:w16cid="http://schemas.microsoft.com/office/word/2016/wordml/cid" xmlns:w16="http://schemas.microsoft.com/office/word/2018/wordml" xmlns:w16du="http://schemas.microsoft.com/office/word/2023/wordml/word16du" xmlns:w16sdtdh="http://schemas.microsoft.com/office/word/2020/wordml/sdtdatahash" xmlns:w16sdtfl="http://schemas.microsoft.com/office/word/2024/wordml/sdtformatlock" xmlns:w16se="http://schemas.microsoft.com/office/word/2015/wordml/symex" xmlns:wpg="http://schemas.microsoft.com/office/word/2010/wordprocessingGroup" xmlns:wpi="http://schemas.microsoft.com/office/word/2010/wordprocessingInk" xmlns:wne="http://schemas.microsoft.com/office/word/2006/wordml" xmlns:wps="http://schemas.microsoft.com/office/word/2010/wordprocessingShape" mc:Ignorable="w14 w15 w16se w16cid w16 w16cex w16sdtdh w16sdtfl w16du wp14">
-  <w:p>
-    <w:pPr>
-      <w:pStyle w:val="Footer"/>
-    </w:pPr>
-  </w:p>
-</w:ftr>
-</file>
-
-<file path=word/footer3.xml><?xml version="1.0" encoding="utf-8"?>
-<w:ftr xmlns:wpc="http://schemas.microsoft.com/office/word/2010/wordprocessingCanvas" xmlns:cx="http://schemas.microsoft.com/office/drawing/2014/chartex" xmlns:cx1="http://schemas.microsoft.com/office/drawing/2015/9/8/chartex" xmlns:cx2="http://schemas.microsoft.com/office/drawing/2015/10/21/chartex" xmlns:cx3="http://schemas.microsoft.com/office/drawing/2016/5/9/chartex" xmlns:cx4="http://schemas.microsoft.com/office/drawing/2016/5/10/chartex" xmlns:cx5="http://schemas.microsoft.com/office/drawing/2016/5/11/chartex" xmlns:cx6="http://schemas.microsoft.com/office/drawing/2016/5/12/chartex" xmlns:cx7="http://schemas.microsoft.com/office/drawing/2016/5/13/chartex" xmlns:cx8="http://schemas.microsoft.com/office/drawing/2016/5/14/chartex" xmlns:mc="http://schemas.openxmlformats.org/markup-compatibility/2006" xmlns:aink="http://schemas.microsoft.com/office/drawing/2016/ink" xmlns:am3d="http://schemas.microsoft.com/office/drawing/2017/model3d" xmlns:o="urn:schemas-microsoft-com:office:office" xmlns:oel="http://schemas.microsoft.com/office/2019/extlst" xmlns:r="http://schemas.openxmlformats.org/officeDocument/2006/relationships" xmlns:m="http://schemas.openxmlformats.org/officeDocument/2006/math" xmlns:v="urn:schemas-microsoft-com:vml" xmlns:wp14="http://schemas.microsoft.com/office/word/2010/wordprocessingDrawing" xmlns:wp="http://schemas.openxmlformats.org/drawingml/2006/wordprocessingDrawing" xmlns:w10="urn:schemas-microsoft-com:office:word" xmlns:w="http://schemas.openxmlformats.org/wordprocessingml/2006/main" xmlns:w14="http://schemas.microsoft.com/office/word/2010/wordml" xmlns:w15="http://schemas.microsoft.com/office/word/2012/wordml" xmlns:w16cex="http://schemas.microsoft.com/office/word/2018/wordml/cex" xmlns:w16cid="http://schemas.microsoft.com/office/word/2016/wordml/cid" xmlns:w16="http://schemas.microsoft.com/office/word/2018/wordml" xmlns:w16du="http://schemas.microsoft.com/office/word/2023/wordml/word16du" xmlns:w16sdtdh="http://schemas.microsoft.com/office/word/2020/wordml/sdtdatahash" xmlns:w16sdtfl="http://schemas.microsoft.com/office/word/2024/wordml/sdtformatlock" xmlns:w16se="http://schemas.microsoft.com/office/word/2015/wordml/symex" xmlns:wpg="http://schemas.microsoft.com/office/word/2010/wordprocessingGroup" xmlns:wpi="http://schemas.microsoft.com/office/word/2010/wordprocessingInk" xmlns:wne="http://schemas.microsoft.com/office/word/2006/wordml" xmlns:wps="http://schemas.microsoft.com/office/word/2010/wordprocessingShape" mc:Ignorable="w14 w15 w16se w16cid w16 w16cex w16sdtdh w16sdtfl w16du wp14">
-  <w:p>
-    <w:pPr>
-      <w:pStyle w:val="Footer"/>
-    </w:pPr>
-  </w:p>
-</w:ftr>
-</file>
-
 <file path=word/footnotes.xml><?xml version="1.0" encoding="utf-8"?>
 <w:footnotes xmlns:wpc="http://schemas.microsoft.com/office/word/2010/wordprocessingCanvas" xmlns:cx="http://schemas.microsoft.com/office/drawing/2014/chartex" xmlns:cx1="http://schemas.microsoft.com/office/drawing/2015/9/8/chartex" xmlns:cx2="http://schemas.microsoft.com/office/drawing/2015/10/21/chartex" xmlns:cx3="http://schemas.microsoft.com/office/drawing/2016/5/9/chartex" xmlns:cx4="http://schemas.microsoft.com/office/drawing/2016/5/10/chartex" xmlns:cx5="http://schemas.microsoft.com/office/drawing/2016/5/11/chartex" xmlns:cx6="http://schemas.microsoft.com/office/drawing/2016/5/12/chartex" xmlns:cx7="http://schemas.microsoft.com/office/drawing/2016/5/13/chartex" xmlns:cx8="http://schemas.microsoft.com/office/drawing/2016/5/14/chartex" xmlns:mc="http://schemas.openxmlformats.org/markup-compatibility/2006" xmlns:aink="http://schemas.microsoft.com/office/drawing/2016/ink" xmlns:am3d="http://schemas.microsoft.com/office/drawing/2017/model3d" xmlns:o="urn:schemas-microsoft-com:office:office" xmlns:oel="http://schemas.microsoft.com/office/2019/extlst" xmlns:r="http://schemas.openxmlformats.org/officeDocument/2006/relationships" xmlns:m="http://schemas.openxmlformats.org/officeDocument/2006/math" xmlns:v="urn:schemas-microsoft-com:vml" xmlns:wp14="http://schemas.microsoft.com/office/word/2010/wordprocessingDrawing" xmlns:wp="http://schemas.openxmlformats.org/drawingml/2006/wordprocessingDrawing" xmlns:w10="urn:schemas-microsoft-com:office:word" xmlns:w="http://schemas.openxmlformats.org/wordprocessingml/2006/main" xmlns:w14="http://schemas.microsoft.com/office/word/2010/wordml" xmlns:w15="http://schemas.microsoft.com/office/word/2012/wordml" xmlns:w16cex="http://schemas.microsoft.com/office/word/2018/wordml/cex" xmlns:w16cid="http://schemas.microsoft.com/office/word/2016/wordml/cid" xmlns:w16="http://schemas.microsoft.com/office/word/2018/wordml" xmlns:w16du="http://schemas.microsoft.com/office/word/2023/wordml/word16du" xmlns:w16sdtdh="http://schemas.microsoft.com/office/word/2020/wordml/sdtdatahash" xmlns:w16sdtfl="http://schemas.microsoft.com/office/word/2024/wordml/sdtformatlock" xmlns:w16se="http://schemas.microsoft.com/office/word/2015/wordml/symex" xmlns:wpg="http://schemas.microsoft.com/office/word/2010/wordprocessingGroup" xmlns:wpi="http://schemas.microsoft.com/office/word/2010/wordprocessingInk" xmlns:wne="http://schemas.microsoft.com/office/word/2006/wordml" xmlns:wps="http://schemas.microsoft.com/office/word/2010/wordprocessingShape" mc:Ignorable="w14 w15 w16se w16cid w16 w16cex w16sdtdh w16sdtfl w16du wp14">
   <w:footnote w:type="separator" w:id="-1">
@@ -100,16 +814,6 @@
 </file>
 
 <file path=word/header1.xml><?xml version="1.0" encoding="utf-8"?>
-<w:hdr xmlns:wpc="http://schemas.microsoft.com/office/word/2010/wordprocessingCanvas" xmlns:cx="http://schemas.microsoft.com/office/drawing/2014/chartex" xmlns:cx1="http://schemas.microsoft.com/office/drawing/2015/9/8/chartex" xmlns:cx2="http://schemas.microsoft.com/office/drawing/2015/10/21/chartex" xmlns:cx3="http://schemas.microsoft.com/office/drawing/2016/5/9/chartex" xmlns:cx4="http://schemas.microsoft.com/office/drawing/2016/5/10/chartex" xmlns:cx5="http://schemas.microsoft.com/office/drawing/2016/5/11/chartex" xmlns:cx6="http://schemas.microsoft.com/office/drawing/2016/5/12/chartex" xmlns:cx7="http://schemas.microsoft.com/office/drawing/2016/5/13/chartex" xmlns:cx8="http://schemas.microsoft.com/office/drawing/2016/5/14/chartex" xmlns:mc="http://schemas.openxmlformats.org/markup-compatibility/2006" xmlns:aink="http://schemas.microsoft.com/office/drawing/2016/ink" xmlns:am3d="http://schemas.microsoft.com/office/drawing/2017/model3d" xmlns:o="urn:schemas-microsoft-com:office:office" xmlns:oel="http://schemas.microsoft.com/office/2019/extlst" xmlns:r="http://schemas.openxmlformats.org/officeDocument/2006/relationships" xmlns:m="http://schemas.openxmlformats.org/officeDocument/2006/math" xmlns:v="urn:schemas-microsoft-com:vml" xmlns:wp14="http://schemas.microsoft.com/office/word/2010/wordprocessingDrawing" xmlns:wp="http://schemas.openxmlformats.org/drawingml/2006/wordprocessingDrawing" xmlns:w10="urn:schemas-microsoft-com:office:word" xmlns:w="http://schemas.openxmlformats.org/wordprocessingml/2006/main" xmlns:w14="http://schemas.microsoft.com/office/word/2010/wordml" xmlns:w15="http://schemas.microsoft.com/office/word/2012/wordml" xmlns:w16cex="http://schemas.microsoft.com/office/word/2018/wordml/cex" xmlns:w16cid="http://schemas.microsoft.com/office/word/2016/wordml/cid" xmlns:w16="http://schemas.microsoft.com/office/word/2018/wordml" xmlns:w16du="http://schemas.microsoft.com/office/word/2023/wordml/word16du" xmlns:w16sdtdh="http://schemas.microsoft.com/office/word/2020/wordml/sdtdatahash" xmlns:w16sdtfl="http://schemas.microsoft.com/office/word/2024/wordml/sdtformatlock" xmlns:w16se="http://schemas.microsoft.com/office/word/2015/wordml/symex" xmlns:wpg="http://schemas.microsoft.com/office/word/2010/wordprocessingGroup" xmlns:wpi="http://schemas.microsoft.com/office/word/2010/wordprocessingInk" xmlns:wne="http://schemas.microsoft.com/office/word/2006/wordml" xmlns:wps="http://schemas.microsoft.com/office/word/2010/wordprocessingShape" mc:Ignorable="w14 w15 w16se w16cid w16 w16cex w16sdtdh w16sdtfl w16du wp14">
-  <w:p>
-    <w:pPr>
-      <w:pStyle w:val="Header"/>
-    </w:pPr>
-  </w:p>
-</w:hdr>
-</file>
-
-<file path=word/header2.xml><?xml version="1.0" encoding="utf-8"?>
 <w:hdr xmlns:wpc="http://schemas.microsoft.com/office/word/2010/wordprocessingCanvas" xmlns:cx="http://schemas.microsoft.com/office/drawing/2014/chartex" xmlns:cx1="http://schemas.microsoft.com/office/drawing/2015/9/8/chartex" xmlns:cx2="http://schemas.microsoft.com/office/drawing/2015/10/21/chartex" xmlns:cx3="http://schemas.microsoft.com/office/drawing/2016/5/9/chartex" xmlns:cx4="http://schemas.microsoft.com/office/drawing/2016/5/10/chartex" xmlns:cx5="http://schemas.microsoft.com/office/drawing/2016/5/11/chartex" xmlns:cx6="http://schemas.microsoft.com/office/drawing/2016/5/12/chartex" xmlns:cx7="http://schemas.microsoft.com/office/drawing/2016/5/13/chartex" xmlns:cx8="http://schemas.microsoft.com/office/drawing/2016/5/14/chartex" xmlns:mc="http://schemas.openxmlformats.org/markup-compatibility/2006" xmlns:aink="http://schemas.microsoft.com/office/drawing/2016/ink" xmlns:am3d="http://schemas.microsoft.com/office/drawing/2017/model3d" xmlns:o="urn:schemas-microsoft-com:office:office" xmlns:oel="http://schemas.microsoft.com/office/2019/extlst" xmlns:r="http://schemas.openxmlformats.org/officeDocument/2006/relationships" xmlns:m="http://schemas.openxmlformats.org/officeDocument/2006/math" xmlns:v="urn:schemas-microsoft-com:vml" xmlns:wp14="http://schemas.microsoft.com/office/word/2010/wordprocessingDrawing" xmlns:wp="http://schemas.openxmlformats.org/drawingml/2006/wordprocessingDrawing" xmlns:w10="urn:schemas-microsoft-com:office:word" xmlns:w="http://schemas.openxmlformats.org/wordprocessingml/2006/main" xmlns:w14="http://schemas.microsoft.com/office/word/2010/wordml" xmlns:w15="http://schemas.microsoft.com/office/word/2012/wordml" xmlns:w16cex="http://schemas.microsoft.com/office/word/2018/wordml/cex" xmlns:w16cid="http://schemas.microsoft.com/office/word/2016/wordml/cid" xmlns:w16="http://schemas.microsoft.com/office/word/2018/wordml" xmlns:w16du="http://schemas.microsoft.com/office/word/2023/wordml/word16du" xmlns:w16sdtdh="http://schemas.microsoft.com/office/word/2020/wordml/sdtdatahash" xmlns:w16sdtfl="http://schemas.microsoft.com/office/word/2024/wordml/sdtformatlock" xmlns:w16se="http://schemas.microsoft.com/office/word/2015/wordml/symex" xmlns:wpg="http://schemas.microsoft.com/office/word/2010/wordprocessingGroup" xmlns:wpi="http://schemas.microsoft.com/office/word/2010/wordprocessingInk" xmlns:wne="http://schemas.microsoft.com/office/word/2006/wordml" xmlns:wps="http://schemas.microsoft.com/office/word/2010/wordprocessingShape" mc:Ignorable="w14 w15 w16se w16cid w16 w16cex w16sdtdh w16sdtfl w16du wp14">
   <w:p>
     <w:pPr>
@@ -171,14 +875,465 @@
 </w:hdr>
 </file>
 
-<file path=word/header3.xml><?xml version="1.0" encoding="utf-8"?>
-<w:hdr xmlns:wpc="http://schemas.microsoft.com/office/word/2010/wordprocessingCanvas" xmlns:cx="http://schemas.microsoft.com/office/drawing/2014/chartex" xmlns:cx1="http://schemas.microsoft.com/office/drawing/2015/9/8/chartex" xmlns:cx2="http://schemas.microsoft.com/office/drawing/2015/10/21/chartex" xmlns:cx3="http://schemas.microsoft.com/office/drawing/2016/5/9/chartex" xmlns:cx4="http://schemas.microsoft.com/office/drawing/2016/5/10/chartex" xmlns:cx5="http://schemas.microsoft.com/office/drawing/2016/5/11/chartex" xmlns:cx6="http://schemas.microsoft.com/office/drawing/2016/5/12/chartex" xmlns:cx7="http://schemas.microsoft.com/office/drawing/2016/5/13/chartex" xmlns:cx8="http://schemas.microsoft.com/office/drawing/2016/5/14/chartex" xmlns:mc="http://schemas.openxmlformats.org/markup-compatibility/2006" xmlns:aink="http://schemas.microsoft.com/office/drawing/2016/ink" xmlns:am3d="http://schemas.microsoft.com/office/drawing/2017/model3d" xmlns:o="urn:schemas-microsoft-com:office:office" xmlns:oel="http://schemas.microsoft.com/office/2019/extlst" xmlns:r="http://schemas.openxmlformats.org/officeDocument/2006/relationships" xmlns:m="http://schemas.openxmlformats.org/officeDocument/2006/math" xmlns:v="urn:schemas-microsoft-com:vml" xmlns:wp14="http://schemas.microsoft.com/office/word/2010/wordprocessingDrawing" xmlns:wp="http://schemas.openxmlformats.org/drawingml/2006/wordprocessingDrawing" xmlns:w10="urn:schemas-microsoft-com:office:word" xmlns:w="http://schemas.openxmlformats.org/wordprocessingml/2006/main" xmlns:w14="http://schemas.microsoft.com/office/word/2010/wordml" xmlns:w15="http://schemas.microsoft.com/office/word/2012/wordml" xmlns:w16cex="http://schemas.microsoft.com/office/word/2018/wordml/cex" xmlns:w16cid="http://schemas.microsoft.com/office/word/2016/wordml/cid" xmlns:w16="http://schemas.microsoft.com/office/word/2018/wordml" xmlns:w16du="http://schemas.microsoft.com/office/word/2023/wordml/word16du" xmlns:w16sdtdh="http://schemas.microsoft.com/office/word/2020/wordml/sdtdatahash" xmlns:w16sdtfl="http://schemas.microsoft.com/office/word/2024/wordml/sdtformatlock" xmlns:w16se="http://schemas.microsoft.com/office/word/2015/wordml/symex" xmlns:wpg="http://schemas.microsoft.com/office/word/2010/wordprocessingGroup" xmlns:wpi="http://schemas.microsoft.com/office/word/2010/wordprocessingInk" xmlns:wne="http://schemas.microsoft.com/office/word/2006/wordml" xmlns:wps="http://schemas.microsoft.com/office/word/2010/wordprocessingShape" mc:Ignorable="w14 w15 w16se w16cid w16 w16cex w16sdtdh w16sdtfl w16du wp14">
-  <w:p>
-    <w:pPr>
-      <w:pStyle w:val="Header"/>
-    </w:pPr>
-  </w:p>
-</w:hdr>
+<file path=word/numbering.xml><?xml version="1.0" encoding="utf-8"?>
+<w:numbering xmlns:wpc="http://schemas.microsoft.com/office/word/2010/wordprocessingCanvas" xmlns:cx="http://schemas.microsoft.com/office/drawing/2014/chartex" xmlns:cx1="http://schemas.microsoft.com/office/drawing/2015/9/8/chartex" xmlns:cx2="http://schemas.microsoft.com/office/drawing/2015/10/21/chartex" xmlns:cx3="http://schemas.microsoft.com/office/drawing/2016/5/9/chartex" xmlns:cx4="http://schemas.microsoft.com/office/drawing/2016/5/10/chartex" xmlns:cx5="http://schemas.microsoft.com/office/drawing/2016/5/11/chartex" xmlns:cx6="http://schemas.microsoft.com/office/drawing/2016/5/12/chartex" xmlns:cx7="http://schemas.microsoft.com/office/drawing/2016/5/13/chartex" xmlns:cx8="http://schemas.microsoft.com/office/drawing/2016/5/14/chartex" xmlns:mc="http://schemas.openxmlformats.org/markup-compatibility/2006" xmlns:aink="http://schemas.microsoft.com/office/drawing/2016/ink" xmlns:am3d="http://schemas.microsoft.com/office/drawing/2017/model3d" xmlns:o="urn:schemas-microsoft-com:office:office" xmlns:oel="http://schemas.microsoft.com/office/2019/extlst" xmlns:r="http://schemas.openxmlformats.org/officeDocument/2006/relationships" xmlns:m="http://schemas.openxmlformats.org/officeDocument/2006/math" xmlns:v="urn:schemas-microsoft-com:vml" xmlns:wp14="http://schemas.microsoft.com/office/word/2010/wordprocessingDrawing" xmlns:wp="http://schemas.openxmlformats.org/drawingml/2006/wordprocessingDrawing" xmlns:w10="urn:schemas-microsoft-com:office:word" xmlns:w="http://schemas.openxmlformats.org/wordprocessingml/2006/main" xmlns:w14="http://schemas.microsoft.com/office/word/2010/wordml" xmlns:w15="http://schemas.microsoft.com/office/word/2012/wordml" xmlns:w16cex="http://schemas.microsoft.com/office/word/2018/wordml/cex" xmlns:w16cid="http://schemas.microsoft.com/office/word/2016/wordml/cid" xmlns:w16="http://schemas.microsoft.com/office/word/2018/wordml" xmlns:w16du="http://schemas.microsoft.com/office/word/2023/wordml/word16du" xmlns:w16sdtdh="http://schemas.microsoft.com/office/word/2020/wordml/sdtdatahash" xmlns:w16sdtfl="http://schemas.microsoft.com/office/word/2024/wordml/sdtformatlock" xmlns:w16se="http://schemas.microsoft.com/office/word/2015/wordml/symex" xmlns:wpg="http://schemas.microsoft.com/office/word/2010/wordprocessingGroup" xmlns:wpi="http://schemas.microsoft.com/office/word/2010/wordprocessingInk" xmlns:wne="http://schemas.microsoft.com/office/word/2006/wordml" xmlns:wps="http://schemas.microsoft.com/office/word/2010/wordprocessingShape" mc:Ignorable="w14 w15 w16se w16cid w16 w16cex w16sdtdh w16sdtfl w16du wp14">
+  <w:abstractNum w:abstractNumId="0" w15:restartNumberingAfterBreak="0">
+    <w:nsid w:val="122E1D64"/>
+    <w:multiLevelType w:val="multilevel"/>
+    <w:tmpl w:val="7AC6A1D4"/>
+    <w:lvl w:ilvl="0">
+      <w:start w:val="1"/>
+      <w:numFmt w:val="bullet"/>
+      <w:lvlText w:val=""/>
+      <w:lvlJc w:val="left"/>
+      <w:pPr>
+        <w:tabs>
+          <w:tab w:val="num" w:pos="720"/>
+        </w:tabs>
+        <w:ind w:left="720" w:hanging="360"/>
+      </w:pPr>
+      <w:rPr>
+        <w:rFonts w:ascii="Symbol" w:hAnsi="Symbol" w:hint="default"/>
+        <w:sz w:val="20"/>
+      </w:rPr>
+    </w:lvl>
+    <w:lvl w:ilvl="1" w:tentative="1">
+      <w:start w:val="1"/>
+      <w:numFmt w:val="bullet"/>
+      <w:lvlText w:val="o"/>
+      <w:lvlJc w:val="left"/>
+      <w:pPr>
+        <w:tabs>
+          <w:tab w:val="num" w:pos="1440"/>
+        </w:tabs>
+        <w:ind w:left="1440" w:hanging="360"/>
+      </w:pPr>
+      <w:rPr>
+        <w:rFonts w:ascii="Courier New" w:hAnsi="Courier New" w:hint="default"/>
+        <w:sz w:val="20"/>
+      </w:rPr>
+    </w:lvl>
+    <w:lvl w:ilvl="2" w:tentative="1">
+      <w:start w:val="1"/>
+      <w:numFmt w:val="bullet"/>
+      <w:lvlText w:val=""/>
+      <w:lvlJc w:val="left"/>
+      <w:pPr>
+        <w:tabs>
+          <w:tab w:val="num" w:pos="2160"/>
+        </w:tabs>
+        <w:ind w:left="2160" w:hanging="360"/>
+      </w:pPr>
+      <w:rPr>
+        <w:rFonts w:ascii="Wingdings" w:hAnsi="Wingdings" w:hint="default"/>
+        <w:sz w:val="20"/>
+      </w:rPr>
+    </w:lvl>
+    <w:lvl w:ilvl="3" w:tentative="1">
+      <w:start w:val="1"/>
+      <w:numFmt w:val="bullet"/>
+      <w:lvlText w:val=""/>
+      <w:lvlJc w:val="left"/>
+      <w:pPr>
+        <w:tabs>
+          <w:tab w:val="num" w:pos="2880"/>
+        </w:tabs>
+        <w:ind w:left="2880" w:hanging="360"/>
+      </w:pPr>
+      <w:rPr>
+        <w:rFonts w:ascii="Wingdings" w:hAnsi="Wingdings" w:hint="default"/>
+        <w:sz w:val="20"/>
+      </w:rPr>
+    </w:lvl>
+    <w:lvl w:ilvl="4" w:tentative="1">
+      <w:start w:val="1"/>
+      <w:numFmt w:val="bullet"/>
+      <w:lvlText w:val=""/>
+      <w:lvlJc w:val="left"/>
+      <w:pPr>
+        <w:tabs>
+          <w:tab w:val="num" w:pos="3600"/>
+        </w:tabs>
+        <w:ind w:left="3600" w:hanging="360"/>
+      </w:pPr>
+      <w:rPr>
+        <w:rFonts w:ascii="Wingdings" w:hAnsi="Wingdings" w:hint="default"/>
+        <w:sz w:val="20"/>
+      </w:rPr>
+    </w:lvl>
+    <w:lvl w:ilvl="5" w:tentative="1">
+      <w:start w:val="1"/>
+      <w:numFmt w:val="bullet"/>
+      <w:lvlText w:val=""/>
+      <w:lvlJc w:val="left"/>
+      <w:pPr>
+        <w:tabs>
+          <w:tab w:val="num" w:pos="4320"/>
+        </w:tabs>
+        <w:ind w:left="4320" w:hanging="360"/>
+      </w:pPr>
+      <w:rPr>
+        <w:rFonts w:ascii="Wingdings" w:hAnsi="Wingdings" w:hint="default"/>
+        <w:sz w:val="20"/>
+      </w:rPr>
+    </w:lvl>
+    <w:lvl w:ilvl="6" w:tentative="1">
+      <w:start w:val="1"/>
+      <w:numFmt w:val="bullet"/>
+      <w:lvlText w:val=""/>
+      <w:lvlJc w:val="left"/>
+      <w:pPr>
+        <w:tabs>
+          <w:tab w:val="num" w:pos="5040"/>
+        </w:tabs>
+        <w:ind w:left="5040" w:hanging="360"/>
+      </w:pPr>
+      <w:rPr>
+        <w:rFonts w:ascii="Wingdings" w:hAnsi="Wingdings" w:hint="default"/>
+        <w:sz w:val="20"/>
+      </w:rPr>
+    </w:lvl>
+    <w:lvl w:ilvl="7" w:tentative="1">
+      <w:start w:val="1"/>
+      <w:numFmt w:val="bullet"/>
+      <w:lvlText w:val=""/>
+      <w:lvlJc w:val="left"/>
+      <w:pPr>
+        <w:tabs>
+          <w:tab w:val="num" w:pos="5760"/>
+        </w:tabs>
+        <w:ind w:left="5760" w:hanging="360"/>
+      </w:pPr>
+      <w:rPr>
+        <w:rFonts w:ascii="Wingdings" w:hAnsi="Wingdings" w:hint="default"/>
+        <w:sz w:val="20"/>
+      </w:rPr>
+    </w:lvl>
+    <w:lvl w:ilvl="8" w:tentative="1">
+      <w:start w:val="1"/>
+      <w:numFmt w:val="bullet"/>
+      <w:lvlText w:val=""/>
+      <w:lvlJc w:val="left"/>
+      <w:pPr>
+        <w:tabs>
+          <w:tab w:val="num" w:pos="6480"/>
+        </w:tabs>
+        <w:ind w:left="6480" w:hanging="360"/>
+      </w:pPr>
+      <w:rPr>
+        <w:rFonts w:ascii="Wingdings" w:hAnsi="Wingdings" w:hint="default"/>
+        <w:sz w:val="20"/>
+      </w:rPr>
+    </w:lvl>
+  </w:abstractNum>
+  <w:abstractNum w:abstractNumId="1" w15:restartNumberingAfterBreak="0">
+    <w:nsid w:val="1F720378"/>
+    <w:multiLevelType w:val="multilevel"/>
+    <w:tmpl w:val="7A241E5A"/>
+    <w:lvl w:ilvl="0">
+      <w:start w:val="1"/>
+      <w:numFmt w:val="bullet"/>
+      <w:lvlText w:val=""/>
+      <w:lvlJc w:val="left"/>
+      <w:pPr>
+        <w:tabs>
+          <w:tab w:val="num" w:pos="720"/>
+        </w:tabs>
+        <w:ind w:left="720" w:hanging="360"/>
+      </w:pPr>
+      <w:rPr>
+        <w:rFonts w:ascii="Symbol" w:hAnsi="Symbol" w:hint="default"/>
+        <w:sz w:val="20"/>
+      </w:rPr>
+    </w:lvl>
+    <w:lvl w:ilvl="1" w:tentative="1">
+      <w:start w:val="1"/>
+      <w:numFmt w:val="bullet"/>
+      <w:lvlText w:val="o"/>
+      <w:lvlJc w:val="left"/>
+      <w:pPr>
+        <w:tabs>
+          <w:tab w:val="num" w:pos="1440"/>
+        </w:tabs>
+        <w:ind w:left="1440" w:hanging="360"/>
+      </w:pPr>
+      <w:rPr>
+        <w:rFonts w:ascii="Courier New" w:hAnsi="Courier New" w:hint="default"/>
+        <w:sz w:val="20"/>
+      </w:rPr>
+    </w:lvl>
+    <w:lvl w:ilvl="2" w:tentative="1">
+      <w:start w:val="1"/>
+      <w:numFmt w:val="bullet"/>
+      <w:lvlText w:val=""/>
+      <w:lvlJc w:val="left"/>
+      <w:pPr>
+        <w:tabs>
+          <w:tab w:val="num" w:pos="2160"/>
+        </w:tabs>
+        <w:ind w:left="2160" w:hanging="360"/>
+      </w:pPr>
+      <w:rPr>
+        <w:rFonts w:ascii="Wingdings" w:hAnsi="Wingdings" w:hint="default"/>
+        <w:sz w:val="20"/>
+      </w:rPr>
+    </w:lvl>
+    <w:lvl w:ilvl="3" w:tentative="1">
+      <w:start w:val="1"/>
+      <w:numFmt w:val="bullet"/>
+      <w:lvlText w:val=""/>
+      <w:lvlJc w:val="left"/>
+      <w:pPr>
+        <w:tabs>
+          <w:tab w:val="num" w:pos="2880"/>
+        </w:tabs>
+        <w:ind w:left="2880" w:hanging="360"/>
+      </w:pPr>
+      <w:rPr>
+        <w:rFonts w:ascii="Wingdings" w:hAnsi="Wingdings" w:hint="default"/>
+        <w:sz w:val="20"/>
+      </w:rPr>
+    </w:lvl>
+    <w:lvl w:ilvl="4" w:tentative="1">
+      <w:start w:val="1"/>
+      <w:numFmt w:val="bullet"/>
+      <w:lvlText w:val=""/>
+      <w:lvlJc w:val="left"/>
+      <w:pPr>
+        <w:tabs>
+          <w:tab w:val="num" w:pos="3600"/>
+        </w:tabs>
+        <w:ind w:left="3600" w:hanging="360"/>
+      </w:pPr>
+      <w:rPr>
+        <w:rFonts w:ascii="Wingdings" w:hAnsi="Wingdings" w:hint="default"/>
+        <w:sz w:val="20"/>
+      </w:rPr>
+    </w:lvl>
+    <w:lvl w:ilvl="5" w:tentative="1">
+      <w:start w:val="1"/>
+      <w:numFmt w:val="bullet"/>
+      <w:lvlText w:val=""/>
+      <w:lvlJc w:val="left"/>
+      <w:pPr>
+        <w:tabs>
+          <w:tab w:val="num" w:pos="4320"/>
+        </w:tabs>
+        <w:ind w:left="4320" w:hanging="360"/>
+      </w:pPr>
+      <w:rPr>
+        <w:rFonts w:ascii="Wingdings" w:hAnsi="Wingdings" w:hint="default"/>
+        <w:sz w:val="20"/>
+      </w:rPr>
+    </w:lvl>
+    <w:lvl w:ilvl="6" w:tentative="1">
+      <w:start w:val="1"/>
+      <w:numFmt w:val="bullet"/>
+      <w:lvlText w:val=""/>
+      <w:lvlJc w:val="left"/>
+      <w:pPr>
+        <w:tabs>
+          <w:tab w:val="num" w:pos="5040"/>
+        </w:tabs>
+        <w:ind w:left="5040" w:hanging="360"/>
+      </w:pPr>
+      <w:rPr>
+        <w:rFonts w:ascii="Wingdings" w:hAnsi="Wingdings" w:hint="default"/>
+        <w:sz w:val="20"/>
+      </w:rPr>
+    </w:lvl>
+    <w:lvl w:ilvl="7" w:tentative="1">
+      <w:start w:val="1"/>
+      <w:numFmt w:val="bullet"/>
+      <w:lvlText w:val=""/>
+      <w:lvlJc w:val="left"/>
+      <w:pPr>
+        <w:tabs>
+          <w:tab w:val="num" w:pos="5760"/>
+        </w:tabs>
+        <w:ind w:left="5760" w:hanging="360"/>
+      </w:pPr>
+      <w:rPr>
+        <w:rFonts w:ascii="Wingdings" w:hAnsi="Wingdings" w:hint="default"/>
+        <w:sz w:val="20"/>
+      </w:rPr>
+    </w:lvl>
+    <w:lvl w:ilvl="8" w:tentative="1">
+      <w:start w:val="1"/>
+      <w:numFmt w:val="bullet"/>
+      <w:lvlText w:val=""/>
+      <w:lvlJc w:val="left"/>
+      <w:pPr>
+        <w:tabs>
+          <w:tab w:val="num" w:pos="6480"/>
+        </w:tabs>
+        <w:ind w:left="6480" w:hanging="360"/>
+      </w:pPr>
+      <w:rPr>
+        <w:rFonts w:ascii="Wingdings" w:hAnsi="Wingdings" w:hint="default"/>
+        <w:sz w:val="20"/>
+      </w:rPr>
+    </w:lvl>
+  </w:abstractNum>
+  <w:abstractNum w:abstractNumId="2" w15:restartNumberingAfterBreak="0">
+    <w:nsid w:val="7DF56364"/>
+    <w:multiLevelType w:val="multilevel"/>
+    <w:tmpl w:val="610208B8"/>
+    <w:lvl w:ilvl="0">
+      <w:start w:val="1"/>
+      <w:numFmt w:val="bullet"/>
+      <w:lvlText w:val=""/>
+      <w:lvlJc w:val="left"/>
+      <w:pPr>
+        <w:tabs>
+          <w:tab w:val="num" w:pos="720"/>
+        </w:tabs>
+        <w:ind w:left="720" w:hanging="360"/>
+      </w:pPr>
+      <w:rPr>
+        <w:rFonts w:ascii="Symbol" w:hAnsi="Symbol" w:hint="default"/>
+        <w:sz w:val="20"/>
+      </w:rPr>
+    </w:lvl>
+    <w:lvl w:ilvl="1" w:tentative="1">
+      <w:start w:val="1"/>
+      <w:numFmt w:val="bullet"/>
+      <w:lvlText w:val="o"/>
+      <w:lvlJc w:val="left"/>
+      <w:pPr>
+        <w:tabs>
+          <w:tab w:val="num" w:pos="1440"/>
+        </w:tabs>
+        <w:ind w:left="1440" w:hanging="360"/>
+      </w:pPr>
+      <w:rPr>
+        <w:rFonts w:ascii="Courier New" w:hAnsi="Courier New" w:hint="default"/>
+        <w:sz w:val="20"/>
+      </w:rPr>
+    </w:lvl>
+    <w:lvl w:ilvl="2" w:tentative="1">
+      <w:start w:val="1"/>
+      <w:numFmt w:val="bullet"/>
+      <w:lvlText w:val=""/>
+      <w:lvlJc w:val="left"/>
+      <w:pPr>
+        <w:tabs>
+          <w:tab w:val="num" w:pos="2160"/>
+        </w:tabs>
+        <w:ind w:left="2160" w:hanging="360"/>
+      </w:pPr>
+      <w:rPr>
+        <w:rFonts w:ascii="Wingdings" w:hAnsi="Wingdings" w:hint="default"/>
+        <w:sz w:val="20"/>
+      </w:rPr>
+    </w:lvl>
+    <w:lvl w:ilvl="3" w:tentative="1">
+      <w:start w:val="1"/>
+      <w:numFmt w:val="bullet"/>
+      <w:lvlText w:val=""/>
+      <w:lvlJc w:val="left"/>
+      <w:pPr>
+        <w:tabs>
+          <w:tab w:val="num" w:pos="2880"/>
+        </w:tabs>
+        <w:ind w:left="2880" w:hanging="360"/>
+      </w:pPr>
+      <w:rPr>
+        <w:rFonts w:ascii="Wingdings" w:hAnsi="Wingdings" w:hint="default"/>
+        <w:sz w:val="20"/>
+      </w:rPr>
+    </w:lvl>
+    <w:lvl w:ilvl="4" w:tentative="1">
+      <w:start w:val="1"/>
+      <w:numFmt w:val="bullet"/>
+      <w:lvlText w:val=""/>
+      <w:lvlJc w:val="left"/>
+      <w:pPr>
+        <w:tabs>
+          <w:tab w:val="num" w:pos="3600"/>
+        </w:tabs>
+        <w:ind w:left="3600" w:hanging="360"/>
+      </w:pPr>
+      <w:rPr>
+        <w:rFonts w:ascii="Wingdings" w:hAnsi="Wingdings" w:hint="default"/>
+        <w:sz w:val="20"/>
+      </w:rPr>
+    </w:lvl>
+    <w:lvl w:ilvl="5" w:tentative="1">
+      <w:start w:val="1"/>
+      <w:numFmt w:val="bullet"/>
+      <w:lvlText w:val=""/>
+      <w:lvlJc w:val="left"/>
+      <w:pPr>
+        <w:tabs>
+          <w:tab w:val="num" w:pos="4320"/>
+        </w:tabs>
+        <w:ind w:left="4320" w:hanging="360"/>
+      </w:pPr>
+      <w:rPr>
+        <w:rFonts w:ascii="Wingdings" w:hAnsi="Wingdings" w:hint="default"/>
+        <w:sz w:val="20"/>
+      </w:rPr>
+    </w:lvl>
+    <w:lvl w:ilvl="6" w:tentative="1">
+      <w:start w:val="1"/>
+      <w:numFmt w:val="bullet"/>
+      <w:lvlText w:val=""/>
+      <w:lvlJc w:val="left"/>
+      <w:pPr>
+        <w:tabs>
+          <w:tab w:val="num" w:pos="5040"/>
+        </w:tabs>
+        <w:ind w:left="5040" w:hanging="360"/>
+      </w:pPr>
+      <w:rPr>
+        <w:rFonts w:ascii="Wingdings" w:hAnsi="Wingdings" w:hint="default"/>
+        <w:sz w:val="20"/>
+      </w:rPr>
+    </w:lvl>
+    <w:lvl w:ilvl="7" w:tentative="1">
+      <w:start w:val="1"/>
+      <w:numFmt w:val="bullet"/>
+      <w:lvlText w:val=""/>
+      <w:lvlJc w:val="left"/>
+      <w:pPr>
+        <w:tabs>
+          <w:tab w:val="num" w:pos="5760"/>
+        </w:tabs>
+        <w:ind w:left="5760" w:hanging="360"/>
+      </w:pPr>
+      <w:rPr>
+        <w:rFonts w:ascii="Wingdings" w:hAnsi="Wingdings" w:hint="default"/>
+        <w:sz w:val="20"/>
+      </w:rPr>
+    </w:lvl>
+    <w:lvl w:ilvl="8" w:tentative="1">
+      <w:start w:val="1"/>
+      <w:numFmt w:val="bullet"/>
+      <w:lvlText w:val=""/>
+      <w:lvlJc w:val="left"/>
+      <w:pPr>
+        <w:tabs>
+          <w:tab w:val="num" w:pos="6480"/>
+        </w:tabs>
+        <w:ind w:left="6480" w:hanging="360"/>
+      </w:pPr>
+      <w:rPr>
+        <w:rFonts w:ascii="Wingdings" w:hAnsi="Wingdings" w:hint="default"/>
+        <w:sz w:val="20"/>
+      </w:rPr>
+    </w:lvl>
+  </w:abstractNum>
+  <w:num w:numId="1" w16cid:durableId="1507401829">
+    <w:abstractNumId w:val="0"/>
+  </w:num>
+  <w:num w:numId="2" w16cid:durableId="1920600094">
+    <w:abstractNumId w:val="2"/>
+  </w:num>
+  <w:num w:numId="3" w16cid:durableId="1797260936">
+    <w:abstractNumId w:val="1"/>
+  </w:num>
+</w:numbering>
 </file>
 
 <file path=word/styles.xml><?xml version="1.0" encoding="utf-8"?>
@@ -1142,6 +2297,33 @@
     <w:uiPriority w:val="99"/>
     <w:rsid w:val="00B80CF1"/>
   </w:style>
+  <w:style w:type="paragraph" w:styleId="NormalWeb">
+    <w:name w:val="Normal (Web)"/>
+    <w:basedOn w:val="Normal"/>
+    <w:uiPriority w:val="99"/>
+    <w:semiHidden/>
+    <w:unhideWhenUsed/>
+    <w:rsid w:val="003D2820"/>
+    <w:pPr>
+      <w:spacing w:before="100" w:beforeAutospacing="1" w:after="100" w:afterAutospacing="1" w:line="240" w:lineRule="auto"/>
+    </w:pPr>
+    <w:rPr>
+      <w:rFonts w:ascii="Times New Roman" w:eastAsia="Times New Roman" w:hAnsi="Times New Roman" w:cs="Times New Roman"/>
+      <w:kern w:val="0"/>
+      <w14:ligatures w14:val="none"/>
+    </w:rPr>
+  </w:style>
+  <w:style w:type="character" w:styleId="Strong">
+    <w:name w:val="Strong"/>
+    <w:basedOn w:val="DefaultParagraphFont"/>
+    <w:uiPriority w:val="22"/>
+    <w:qFormat/>
+    <w:rsid w:val="003D2820"/>
+    <w:rPr>
+      <w:b/>
+      <w:bCs/>
+    </w:rPr>
+  </w:style>
 </w:styles>
 </file>
 

</xml_diff>